<commit_message>
Trim questionnaire to core Red/Blue team range capability
Refocus the customer questionnaire on what CyberRange actually delivers and
remove auxiliary/aspirational items:

- Retitle to "Red & Blue Team Range — Adoption Questionnaire" and add an honest
  "What CyberRange delivers today" scope note (Linux/Docker ranges, R/B/P roles,
  real container execution, automatic + optional real Wazuh SIEM, timeline,
  scoring, reports; Windows/AD ranges on the roadmap).
- Remove: accreditation frameworks (NICE/CAE/ABET), LMS/LTI grade pass-back,
  SSO/IdP, SIS sync, FERPA/GDPR/residency compliance section, program-level
  analytics, "evidence for accreditation", and content-authoring items.
- Keep/refocus: §6 now "Detection Stack & Access" (bundled Wazuh vs BYO SIEM +
  account provisioning), §8 now "Safety & Isolation", assessment/reporting on
  core after-action outputs.

Co-Authored-By: Claude Fable 5 <noreply@anthropic.com>
</commit_message>
<xml_diff>
--- a/sales/CyberRange_Academic_Questionnaire.docx
+++ b/sales/CyberRange_Academic_Questionnaire.docx
@@ -27,7 +27,7 @@
           <w:sz w:val="28"/>
           <w:szCs w:val="28"/>
         </w:rPr>
-        <w:t xml:space="preserve">Academic Adoption Questionnaire</w:t>
+        <w:t xml:space="preserve">Red &amp; Blue Team Range — Adoption Questionnaire</w:t>
       </w:r>
     </w:p>
     <w:p>
@@ -59,6 +59,28 @@
     </w:p>
     <w:p>
       <w:pPr>
+        <w:spacing w:after="140"/>
+      </w:pPr>
+      <w:r>
+        <w:rPr>
+          <w:b/>
+          <w:bCs/>
+          <w:color w:val="1F4E79"/>
+          <w:sz w:val="20"/>
+          <w:szCs w:val="20"/>
+        </w:rPr>
+        <w:t xml:space="preserve">What CyberRange delivers today:  </w:t>
+      </w:r>
+      <w:r>
+        <w:rPr>
+          <w:sz w:val="20"/>
+          <w:szCs w:val="20"/>
+        </w:rPr>
+        <w:t xml:space="preserve">isolated Linux/Docker ranges with Red, Blue, and Purple roles; real container-based attack execution; automatic detection plus an optional real Wazuh SIEM; a synchronized evidence timeline; scoring; and after-action reports. Windows / Active Directory ranges are on the near-term roadmap. This questionnaire focuses on that core Red/Blue team capability.</w:t>
+      </w:r>
+    </w:p>
+    <w:p>
+      <w:pPr>
         <w:pBdr>
           <w:bottom w:val="single" w:color="1F4E79" w:sz="6" w:space="2"/>
         </w:pBdr>
@@ -72,7 +94,7 @@
           <w:sz w:val="18"/>
           <w:szCs w:val="18"/>
         </w:rPr>
-        <w:t xml:space="preserve">Estimated time to complete: 15–20 minutes</w:t>
+        <w:t xml:space="preserve">Estimated time to complete: 10–15 minutes</w:t>
       </w:r>
     </w:p>
     <w:p>
@@ -759,112 +781,6 @@
     </w:p>
     <w:p>
       <w:pPr>
-        <w:spacing w:after="60" w:before="120"/>
-      </w:pPr>
-      <w:r>
-        <w:rPr>
-          <w:sz w:val="21"/>
-          <w:szCs w:val="21"/>
-        </w:rPr>
-        <w:t xml:space="preserve">Do you align to any frameworks or accreditation? (select all that apply)</w:t>
-      </w:r>
-    </w:p>
-    <w:p>
-      <w:pPr>
-        <w:spacing w:after="40" w:before="40"/>
-      </w:pPr>
-      <w:r>
-        <w:rPr>
-          <w:sz w:val="22"/>
-          <w:szCs w:val="22"/>
-        </w:rPr>
-        <w:t xml:space="preserve">☐ </w:t>
-      </w:r>
-      <w:r>
-        <w:rPr>
-          <w:sz w:val="21"/>
-          <w:szCs w:val="21"/>
-        </w:rPr>
-        <w:t xml:space="preserve">NICE / NIST     </w:t>
-      </w:r>
-      <w:r>
-        <w:rPr>
-          <w:sz w:val="22"/>
-          <w:szCs w:val="22"/>
-        </w:rPr>
-        <w:t xml:space="preserve">☐ </w:t>
-      </w:r>
-      <w:r>
-        <w:rPr>
-          <w:sz w:val="21"/>
-          <w:szCs w:val="21"/>
-        </w:rPr>
-        <w:t xml:space="preserve">NSA CAE-CD     </w:t>
-      </w:r>
-      <w:r>
-        <w:rPr>
-          <w:sz w:val="22"/>
-          <w:szCs w:val="22"/>
-        </w:rPr>
-        <w:t xml:space="preserve">☐ </w:t>
-      </w:r>
-      <w:r>
-        <w:rPr>
-          <w:sz w:val="21"/>
-          <w:szCs w:val="21"/>
-        </w:rPr>
-        <w:t xml:space="preserve">ABET     </w:t>
-      </w:r>
-    </w:p>
-    <w:p>
-      <w:pPr>
-        <w:spacing w:after="40" w:before="40"/>
-      </w:pPr>
-      <w:r>
-        <w:rPr>
-          <w:sz w:val="22"/>
-          <w:szCs w:val="22"/>
-        </w:rPr>
-        <w:t xml:space="preserve">☐ </w:t>
-      </w:r>
-      <w:r>
-        <w:rPr>
-          <w:sz w:val="21"/>
-          <w:szCs w:val="21"/>
-        </w:rPr>
-        <w:t xml:space="preserve">ACM/IEEE curricula     </w:t>
-      </w:r>
-      <w:r>
-        <w:rPr>
-          <w:sz w:val="22"/>
-          <w:szCs w:val="22"/>
-        </w:rPr>
-        <w:t xml:space="preserve">☐ </w:t>
-      </w:r>
-      <w:r>
-        <w:rPr>
-          <w:sz w:val="21"/>
-          <w:szCs w:val="21"/>
-        </w:rPr>
-        <w:t xml:space="preserve">Institution-specific     </w:t>
-      </w:r>
-      <w:r>
-        <w:rPr>
-          <w:sz w:val="22"/>
-          <w:szCs w:val="22"/>
-        </w:rPr>
-        <w:t xml:space="preserve">☐ </w:t>
-      </w:r>
-      <w:r>
-        <w:rPr>
-          <w:sz w:val="21"/>
-          <w:szCs w:val="21"/>
-        </w:rPr>
-        <w:t xml:space="preserve">None / not sure     </w:t>
-      </w:r>
-    </w:p>
-    <w:p>
-      <w:pPr>
         <w:pStyle w:val="Heading1"/>
         <w:spacing w:after="120" w:before="300"/>
       </w:pPr>
@@ -1516,84 +1432,6 @@
     </w:p>
     <w:p>
       <w:pPr>
-        <w:spacing w:after="60" w:before="120"/>
-      </w:pPr>
-      <w:r>
-        <w:rPr>
-          <w:sz w:val="21"/>
-          <w:szCs w:val="21"/>
-        </w:rPr>
-        <w:t xml:space="preserve">Will instructors need to author or customize their own scenarios and detection content?</w:t>
-      </w:r>
-    </w:p>
-    <w:p>
-      <w:pPr>
-        <w:spacing w:after="40" w:before="40"/>
-      </w:pPr>
-      <w:r>
-        <w:rPr>
-          <w:sz w:val="22"/>
-          <w:szCs w:val="22"/>
-        </w:rPr>
-        <w:t xml:space="preserve">☐ </w:t>
-      </w:r>
-      <w:r>
-        <w:rPr>
-          <w:sz w:val="21"/>
-          <w:szCs w:val="21"/>
-        </w:rPr>
-        <w:t xml:space="preserve">Yes, actively     </w:t>
-      </w:r>
-      <w:r>
-        <w:rPr>
-          <w:sz w:val="22"/>
-          <w:szCs w:val="22"/>
-        </w:rPr>
-        <w:t xml:space="preserve">☐ </w:t>
-      </w:r>
-      <w:r>
-        <w:rPr>
-          <w:sz w:val="21"/>
-          <w:szCs w:val="21"/>
-        </w:rPr>
-        <w:t xml:space="preserve">Occasionally     </w:t>
-      </w:r>
-    </w:p>
-    <w:p>
-      <w:pPr>
-        <w:spacing w:after="40" w:before="40"/>
-      </w:pPr>
-      <w:r>
-        <w:rPr>
-          <w:sz w:val="22"/>
-          <w:szCs w:val="22"/>
-        </w:rPr>
-        <w:t xml:space="preserve">☐ </w:t>
-      </w:r>
-      <w:r>
-        <w:rPr>
-          <w:sz w:val="21"/>
-          <w:szCs w:val="21"/>
-        </w:rPr>
-        <w:t xml:space="preserve">No, packaged content is fine     </w:t>
-      </w:r>
-      <w:r>
-        <w:rPr>
-          <w:sz w:val="22"/>
-          <w:szCs w:val="22"/>
-        </w:rPr>
-        <w:t xml:space="preserve">☐ </w:t>
-      </w:r>
-      <w:r>
-        <w:rPr>
-          <w:sz w:val="21"/>
-          <w:szCs w:val="21"/>
-        </w:rPr>
-        <w:t xml:space="preserve">Not sure     </w:t>
-      </w:r>
-    </w:p>
-    <w:p>
-      <w:pPr>
         <w:pStyle w:val="Heading1"/>
         <w:spacing w:after="120" w:before="300"/>
       </w:pPr>
@@ -1939,7 +1777,7 @@
           <w:sz w:val="26"/>
           <w:szCs w:val="26"/>
         </w:rPr>
-        <w:t xml:space="preserve">6.  Integration &amp; Access</w:t>
+        <w:t xml:space="preserve">6.  Detection Stack &amp; Access</w:t>
       </w:r>
     </w:p>
     <w:p>
@@ -1951,28 +1789,101 @@
           <w:sz w:val="21"/>
           <w:szCs w:val="21"/>
         </w:rPr>
-        <w:t xml:space="preserve">Single sign-on / identity provider:</w:t>
-      </w:r>
-      <w:r>
-        <w:rPr>
-          <w:i/>
-          <w:iCs/>
-          <w:color w:val="595959"/>
-          <w:sz w:val="18"/>
-          <w:szCs w:val="18"/>
-        </w:rPr>
-        <w:t xml:space="preserve">  e.g., Azure AD/Entra, Okta, Google, Shibboleth/SAML</w:t>
-      </w:r>
-    </w:p>
-    <w:p>
-      <w:pPr>
-        <w:pBdr>
-          <w:bottom w:val="single" w:color="BFBFBF" w:sz="4" w:space="1"/>
-        </w:pBdr>
-        <w:spacing w:after="90" w:before="90"/>
-      </w:pPr>
-      <w:r>
-        <w:t xml:space="preserve"/>
+        <w:t xml:space="preserve">For the Blue-team SIEM, use the bundled Wazuh or your own?</w:t>
+      </w:r>
+    </w:p>
+    <w:p>
+      <w:pPr>
+        <w:spacing w:after="40" w:before="40"/>
+      </w:pPr>
+      <w:r>
+        <w:rPr>
+          <w:sz w:val="22"/>
+          <w:szCs w:val="22"/>
+        </w:rPr>
+        <w:t xml:space="preserve">☐ </w:t>
+      </w:r>
+      <w:r>
+        <w:rPr>
+          <w:sz w:val="21"/>
+          <w:szCs w:val="21"/>
+        </w:rPr>
+        <w:t xml:space="preserve">Use bundled Wazuh (+ rules)     </w:t>
+      </w:r>
+      <w:r>
+        <w:rPr>
+          <w:sz w:val="22"/>
+          <w:szCs w:val="22"/>
+        </w:rPr>
+        <w:t xml:space="preserve">☐ </w:t>
+      </w:r>
+      <w:r>
+        <w:rPr>
+          <w:sz w:val="21"/>
+          <w:szCs w:val="21"/>
+        </w:rPr>
+        <w:t xml:space="preserve">Splunk     </w:t>
+      </w:r>
+      <w:r>
+        <w:rPr>
+          <w:sz w:val="22"/>
+          <w:szCs w:val="22"/>
+        </w:rPr>
+        <w:t xml:space="preserve">☐ </w:t>
+      </w:r>
+      <w:r>
+        <w:rPr>
+          <w:sz w:val="21"/>
+          <w:szCs w:val="21"/>
+        </w:rPr>
+        <w:t xml:space="preserve">Microsoft Sentinel     </w:t>
+      </w:r>
+    </w:p>
+    <w:p>
+      <w:pPr>
+        <w:spacing w:after="40" w:before="40"/>
+      </w:pPr>
+      <w:r>
+        <w:rPr>
+          <w:sz w:val="22"/>
+          <w:szCs w:val="22"/>
+        </w:rPr>
+        <w:t xml:space="preserve">☐ </w:t>
+      </w:r>
+      <w:r>
+        <w:rPr>
+          <w:sz w:val="21"/>
+          <w:szCs w:val="21"/>
+        </w:rPr>
+        <w:t xml:space="preserve">Elastic     </w:t>
+      </w:r>
+      <w:r>
+        <w:rPr>
+          <w:sz w:val="22"/>
+          <w:szCs w:val="22"/>
+        </w:rPr>
+        <w:t xml:space="preserve">☐ </w:t>
+      </w:r>
+      <w:r>
+        <w:rPr>
+          <w:sz w:val="21"/>
+          <w:szCs w:val="21"/>
+        </w:rPr>
+        <w:t xml:space="preserve">Other     </w:t>
+      </w:r>
+      <w:r>
+        <w:rPr>
+          <w:sz w:val="22"/>
+          <w:szCs w:val="22"/>
+        </w:rPr>
+        <w:t xml:space="preserve">☐ </w:t>
+      </w:r>
+      <w:r>
+        <w:rPr>
+          <w:sz w:val="21"/>
+          <w:szCs w:val="21"/>
+        </w:rPr>
+        <w:t xml:space="preserve">Not sure     </w:t>
       </w:r>
     </w:p>
     <w:p>
@@ -1984,239 +1895,13 @@
           <w:sz w:val="21"/>
           <w:szCs w:val="21"/>
         </w:rPr>
-        <w:t xml:space="preserve">Learning Management System (LMS) — and do you need grade pass-back (LTI)?</w:t>
-      </w:r>
-    </w:p>
-    <w:p>
-      <w:pPr>
-        <w:spacing w:after="40" w:before="40"/>
-      </w:pPr>
-      <w:r>
-        <w:rPr>
-          <w:sz w:val="22"/>
-          <w:szCs w:val="22"/>
-        </w:rPr>
-        <w:t xml:space="preserve">☐ </w:t>
-      </w:r>
-      <w:r>
-        <w:rPr>
-          <w:sz w:val="21"/>
-          <w:szCs w:val="21"/>
-        </w:rPr>
-        <w:t xml:space="preserve">Canvas     </w:t>
-      </w:r>
-      <w:r>
-        <w:rPr>
-          <w:sz w:val="22"/>
-          <w:szCs w:val="22"/>
-        </w:rPr>
-        <w:t xml:space="preserve">☐ </w:t>
-      </w:r>
-      <w:r>
-        <w:rPr>
-          <w:sz w:val="21"/>
-          <w:szCs w:val="21"/>
-        </w:rPr>
-        <w:t xml:space="preserve">Blackboard     </w:t>
-      </w:r>
-      <w:r>
-        <w:rPr>
-          <w:sz w:val="22"/>
-          <w:szCs w:val="22"/>
-        </w:rPr>
-        <w:t xml:space="preserve">☐ </w:t>
-      </w:r>
-      <w:r>
-        <w:rPr>
-          <w:sz w:val="21"/>
-          <w:szCs w:val="21"/>
-        </w:rPr>
-        <w:t xml:space="preserve">Moodle     </w:t>
-      </w:r>
-    </w:p>
-    <w:p>
-      <w:pPr>
-        <w:spacing w:after="40" w:before="40"/>
-      </w:pPr>
-      <w:r>
-        <w:rPr>
-          <w:sz w:val="22"/>
-          <w:szCs w:val="22"/>
-        </w:rPr>
-        <w:t xml:space="preserve">☐ </w:t>
-      </w:r>
-      <w:r>
-        <w:rPr>
-          <w:sz w:val="21"/>
-          <w:szCs w:val="21"/>
-        </w:rPr>
-        <w:t xml:space="preserve">D2L Brightspace     </w:t>
-      </w:r>
-      <w:r>
-        <w:rPr>
-          <w:sz w:val="22"/>
-          <w:szCs w:val="22"/>
-        </w:rPr>
-        <w:t xml:space="preserve">☐ </w:t>
-      </w:r>
-      <w:r>
-        <w:rPr>
-          <w:sz w:val="21"/>
-          <w:szCs w:val="21"/>
-        </w:rPr>
-        <w:t xml:space="preserve">Other     </w:t>
-      </w:r>
-      <w:r>
-        <w:rPr>
-          <w:sz w:val="22"/>
-          <w:szCs w:val="22"/>
-        </w:rPr>
-        <w:t xml:space="preserve">☐ </w:t>
-      </w:r>
-      <w:r>
-        <w:rPr>
-          <w:sz w:val="21"/>
-          <w:szCs w:val="21"/>
-        </w:rPr>
-        <w:t xml:space="preserve">No LMS integration needed     </w:t>
-      </w:r>
-    </w:p>
-    <w:p>
-      <w:pPr>
-        <w:spacing w:after="60" w:before="120"/>
-      </w:pPr>
-      <w:r>
-        <w:rPr>
-          <w:sz w:val="21"/>
-          <w:szCs w:val="21"/>
-        </w:rPr>
-        <w:t xml:space="preserve">Do you have a SIEM/EDR you'd want students to use, or should we bundle one (Wazuh)?</w:t>
-      </w:r>
-    </w:p>
-    <w:p>
-      <w:pPr>
-        <w:spacing w:after="40" w:before="40"/>
-      </w:pPr>
-      <w:r>
-        <w:rPr>
-          <w:sz w:val="22"/>
-          <w:szCs w:val="22"/>
-        </w:rPr>
-        <w:t xml:space="preserve">☐ </w:t>
-      </w:r>
-      <w:r>
-        <w:rPr>
-          <w:sz w:val="21"/>
-          <w:szCs w:val="21"/>
-        </w:rPr>
-        <w:t xml:space="preserve">Use bundled (Wazuh/Suricata/Falco)     </w:t>
-      </w:r>
-      <w:r>
-        <w:rPr>
-          <w:sz w:val="22"/>
-          <w:szCs w:val="22"/>
-        </w:rPr>
-        <w:t xml:space="preserve">☐ </w:t>
-      </w:r>
-      <w:r>
-        <w:rPr>
-          <w:sz w:val="21"/>
-          <w:szCs w:val="21"/>
-        </w:rPr>
-        <w:t xml:space="preserve">Splunk     </w:t>
-      </w:r>
-      <w:r>
-        <w:rPr>
-          <w:sz w:val="22"/>
-          <w:szCs w:val="22"/>
-        </w:rPr>
-        <w:t xml:space="preserve">☐ </w:t>
-      </w:r>
-      <w:r>
-        <w:rPr>
-          <w:sz w:val="21"/>
-          <w:szCs w:val="21"/>
-        </w:rPr>
-        <w:t xml:space="preserve">Microsoft Sentinel     </w:t>
-      </w:r>
-    </w:p>
-    <w:p>
-      <w:pPr>
-        <w:spacing w:after="40" w:before="40"/>
-      </w:pPr>
-      <w:r>
-        <w:rPr>
-          <w:sz w:val="22"/>
-          <w:szCs w:val="22"/>
-        </w:rPr>
-        <w:t xml:space="preserve">☐ </w:t>
-      </w:r>
-      <w:r>
-        <w:rPr>
-          <w:sz w:val="21"/>
-          <w:szCs w:val="21"/>
-        </w:rPr>
-        <w:t xml:space="preserve">Elastic     </w:t>
-      </w:r>
-      <w:r>
-        <w:rPr>
-          <w:sz w:val="22"/>
-          <w:szCs w:val="22"/>
-        </w:rPr>
-        <w:t xml:space="preserve">☐ </w:t>
-      </w:r>
-      <w:r>
-        <w:rPr>
-          <w:sz w:val="21"/>
-          <w:szCs w:val="21"/>
-        </w:rPr>
-        <w:t xml:space="preserve">Other     </w:t>
-      </w:r>
-      <w:r>
-        <w:rPr>
-          <w:sz w:val="22"/>
-          <w:szCs w:val="22"/>
-        </w:rPr>
-        <w:t xml:space="preserve">☐ </w:t>
-      </w:r>
-      <w:r>
-        <w:rPr>
-          <w:sz w:val="21"/>
-          <w:szCs w:val="21"/>
-        </w:rPr>
-        <w:t xml:space="preserve">Not sure     </w:t>
-      </w:r>
-    </w:p>
-    <w:p>
-      <w:pPr>
-        <w:spacing w:after="60" w:before="120"/>
-      </w:pPr>
-      <w:r>
-        <w:rPr>
-          <w:sz w:val="21"/>
-          <w:szCs w:val="21"/>
-        </w:rPr>
-        <w:t xml:space="preserve">How should student/instructor rosters be provisioned?</w:t>
-      </w:r>
-    </w:p>
-    <w:p>
-      <w:pPr>
-        <w:spacing w:after="40" w:before="40"/>
-      </w:pPr>
-      <w:r>
-        <w:rPr>
-          <w:sz w:val="22"/>
-          <w:szCs w:val="22"/>
-        </w:rPr>
-        <w:t xml:space="preserve">☐ </w:t>
-      </w:r>
-      <w:r>
-        <w:rPr>
-          <w:sz w:val="21"/>
-          <w:szCs w:val="21"/>
-        </w:rPr>
-        <w:t xml:space="preserve">SIS / directory sync     </w:t>
-      </w:r>
+        <w:t xml:space="preserve">How should participant accounts be provisioned?</w:t>
+      </w:r>
+    </w:p>
+    <w:p>
+      <w:pPr>
+        <w:spacing w:after="40" w:before="40"/>
+      </w:pPr>
       <w:r>
         <w:rPr>
           <w:sz w:val="22"/>
@@ -2231,24 +1916,19 @@
         </w:rPr>
         <w:t xml:space="preserve">CSV upload     </w:t>
       </w:r>
-    </w:p>
-    <w:p>
-      <w:pPr>
-        <w:spacing w:after="40" w:before="40"/>
-      </w:pPr>
-      <w:r>
-        <w:rPr>
-          <w:sz w:val="22"/>
-          <w:szCs w:val="22"/>
-        </w:rPr>
-        <w:t xml:space="preserve">☐ </w:t>
-      </w:r>
-      <w:r>
-        <w:rPr>
-          <w:sz w:val="21"/>
-          <w:szCs w:val="21"/>
-        </w:rPr>
-        <w:t xml:space="preserve">Manual     </w:t>
+      <w:r>
+        <w:rPr>
+          <w:sz w:val="22"/>
+          <w:szCs w:val="22"/>
+        </w:rPr>
+        <w:t xml:space="preserve">☐ </w:t>
+      </w:r>
+      <w:r>
+        <w:rPr>
+          <w:sz w:val="21"/>
+          <w:szCs w:val="21"/>
+        </w:rPr>
+        <w:t xml:space="preserve">Manual (admin panel)     </w:t>
       </w:r>
       <w:r>
         <w:rPr>
@@ -2342,54 +2022,40 @@
           <w:sz w:val="21"/>
           <w:szCs w:val="21"/>
         </w:rPr>
-        <w:t xml:space="preserve">Per-student reports     </w:t>
-      </w:r>
-      <w:r>
-        <w:rPr>
-          <w:sz w:val="22"/>
-          <w:szCs w:val="22"/>
-        </w:rPr>
-        <w:t xml:space="preserve">☐ </w:t>
-      </w:r>
-      <w:r>
-        <w:rPr>
-          <w:sz w:val="21"/>
-          <w:szCs w:val="21"/>
-        </w:rPr>
-        <w:t xml:space="preserve">Instructor / cohort reports     </w:t>
-      </w:r>
-    </w:p>
-    <w:p>
-      <w:pPr>
-        <w:spacing w:after="40" w:before="40"/>
-      </w:pPr>
-      <w:r>
-        <w:rPr>
-          <w:sz w:val="22"/>
-          <w:szCs w:val="22"/>
-        </w:rPr>
-        <w:t xml:space="preserve">☐ </w:t>
-      </w:r>
-      <w:r>
-        <w:rPr>
-          <w:sz w:val="21"/>
-          <w:szCs w:val="21"/>
-        </w:rPr>
-        <w:t xml:space="preserve">Program-level analytics     </w:t>
-      </w:r>
-      <w:r>
-        <w:rPr>
-          <w:sz w:val="22"/>
-          <w:szCs w:val="22"/>
-        </w:rPr>
-        <w:t xml:space="preserve">☐ </w:t>
-      </w:r>
-      <w:r>
-        <w:rPr>
-          <w:sz w:val="21"/>
-          <w:szCs w:val="21"/>
-        </w:rPr>
-        <w:t xml:space="preserve">Evidence for accreditation     </w:t>
+        <w:t xml:space="preserve">Per-participant reports     </w:t>
+      </w:r>
+      <w:r>
+        <w:rPr>
+          <w:sz w:val="22"/>
+          <w:szCs w:val="22"/>
+        </w:rPr>
+        <w:t xml:space="preserve">☐ </w:t>
+      </w:r>
+      <w:r>
+        <w:rPr>
+          <w:sz w:val="21"/>
+          <w:szCs w:val="21"/>
+        </w:rPr>
+        <w:t xml:space="preserve">Team / cohort reports     </w:t>
+      </w:r>
+    </w:p>
+    <w:p>
+      <w:pPr>
+        <w:spacing w:after="40" w:before="40"/>
+      </w:pPr>
+      <w:r>
+        <w:rPr>
+          <w:sz w:val="22"/>
+          <w:szCs w:val="22"/>
+        </w:rPr>
+        <w:t xml:space="preserve">☐ </w:t>
+      </w:r>
+      <w:r>
+        <w:rPr>
+          <w:sz w:val="21"/>
+          <w:szCs w:val="21"/>
+        </w:rPr>
+        <w:t xml:space="preserve">After-action timeline &amp; evidence     </w:t>
       </w:r>
     </w:p>
     <w:p>
@@ -2478,7 +2144,7 @@
           <w:sz w:val="26"/>
           <w:szCs w:val="26"/>
         </w:rPr>
-        <w:t xml:space="preserve">8.  Security, Safety &amp; Compliance</w:t>
+        <w:t xml:space="preserve">8.  Safety &amp; Isolation</w:t>
       </w:r>
     </w:p>
     <w:p>
@@ -2490,73 +2156,40 @@
           <w:sz w:val="21"/>
           <w:szCs w:val="21"/>
         </w:rPr>
-        <w:t xml:space="preserve">Applicable data-privacy or compliance requirements: (select all that apply)</w:t>
-      </w:r>
-    </w:p>
-    <w:p>
-      <w:pPr>
-        <w:spacing w:after="40" w:before="40"/>
-      </w:pPr>
-      <w:r>
-        <w:rPr>
-          <w:sz w:val="22"/>
-          <w:szCs w:val="22"/>
-        </w:rPr>
-        <w:t xml:space="preserve">☐ </w:t>
-      </w:r>
-      <w:r>
-        <w:rPr>
-          <w:sz w:val="21"/>
-          <w:szCs w:val="21"/>
-        </w:rPr>
-        <w:t xml:space="preserve">FERPA     </w:t>
-      </w:r>
-      <w:r>
-        <w:rPr>
-          <w:sz w:val="22"/>
-          <w:szCs w:val="22"/>
-        </w:rPr>
-        <w:t xml:space="preserve">☐ </w:t>
-      </w:r>
-      <w:r>
-        <w:rPr>
-          <w:sz w:val="21"/>
-          <w:szCs w:val="21"/>
-        </w:rPr>
-        <w:t xml:space="preserve">GDPR     </w:t>
-      </w:r>
-      <w:r>
-        <w:rPr>
-          <w:sz w:val="22"/>
-          <w:szCs w:val="22"/>
-        </w:rPr>
-        <w:t xml:space="preserve">☐ </w:t>
-      </w:r>
-      <w:r>
-        <w:rPr>
-          <w:sz w:val="21"/>
-          <w:szCs w:val="21"/>
-        </w:rPr>
-        <w:t xml:space="preserve">Regional data residency     </w:t>
-      </w:r>
-    </w:p>
-    <w:p>
-      <w:pPr>
-        <w:spacing w:after="40" w:before="40"/>
-      </w:pPr>
-      <w:r>
-        <w:rPr>
-          <w:sz w:val="22"/>
-          <w:szCs w:val="22"/>
-        </w:rPr>
-        <w:t xml:space="preserve">☐ </w:t>
-      </w:r>
-      <w:r>
-        <w:rPr>
-          <w:sz w:val="21"/>
-          <w:szCs w:val="21"/>
-        </w:rPr>
-        <w:t xml:space="preserve">Institutional InfoSec review     </w:t>
+        <w:t xml:space="preserve">Range isolation requirement:</w:t>
+      </w:r>
+    </w:p>
+    <w:p>
+      <w:pPr>
+        <w:spacing w:after="40" w:before="40"/>
+      </w:pPr>
+      <w:r>
+        <w:rPr>
+          <w:sz w:val="22"/>
+          <w:szCs w:val="22"/>
+        </w:rPr>
+        <w:t xml:space="preserve">☐ </w:t>
+      </w:r>
+      <w:r>
+        <w:rPr>
+          <w:sz w:val="21"/>
+          <w:szCs w:val="21"/>
+        </w:rPr>
+        <w:t xml:space="preserve">Fully isolated (default-deny, no internet)     </w:t>
+      </w:r>
+      <w:r>
+        <w:rPr>
+          <w:sz w:val="22"/>
+          <w:szCs w:val="22"/>
+        </w:rPr>
+        <w:t xml:space="preserve">☐ </w:t>
+      </w:r>
+      <w:r>
+        <w:rPr>
+          <w:sz w:val="21"/>
+          <w:szCs w:val="21"/>
+        </w:rPr>
+        <w:t xml:space="preserve">Allowlisted proxy only     </w:t>
       </w:r>
       <w:r>
         <w:rPr>
@@ -2582,7 +2215,7 @@
           <w:sz w:val="21"/>
           <w:szCs w:val="21"/>
         </w:rPr>
-        <w:t xml:space="preserve">Any institutional policies we should know about (acceptable use, prohibited tools, network rules)?</w:t>
+        <w:t xml:space="preserve">Any acceptable-use, prohibited-tool, or network-security policies we should know about?</w:t>
       </w:r>
     </w:p>
     <w:p>
@@ -2632,7 +2265,7 @@
           <w:sz w:val="21"/>
           <w:szCs w:val="21"/>
         </w:rPr>
-        <w:t xml:space="preserve">Faculty / staff training needs:</w:t>
+        <w:t xml:space="preserve">Instructor / staff enablement needs:</w:t>
       </w:r>
     </w:p>
     <w:p>
@@ -2653,25 +2286,6 @@
         </w:rPr>
         <w:t xml:space="preserve">Instructor onboarding     </w:t>
       </w:r>
-      <w:r>
-        <w:rPr>
-          <w:sz w:val="22"/>
-          <w:szCs w:val="22"/>
-        </w:rPr>
-        <w:t xml:space="preserve">☐ </w:t>
-      </w:r>
-      <w:r>
-        <w:rPr>
-          <w:sz w:val="21"/>
-          <w:szCs w:val="21"/>
-        </w:rPr>
-        <w:t xml:space="preserve">Content-authoring training     </w:t>
-      </w:r>
-    </w:p>
-    <w:p>
-      <w:pPr>
-        <w:spacing w:after="40" w:before="40"/>
-      </w:pPr>
       <w:r>
         <w:rPr>
           <w:sz w:val="22"/>

</xml_diff>

<commit_message>
Remove em dashes from the questionnaire
Replace all em dashes (title, intro, licensing option, doc title) with plain
punctuation per preference. Zero em dashes in the script and generated docx.

Co-Authored-By: Claude Opus 4.8 <noreply@anthropic.com>
</commit_message>
<xml_diff>
--- a/sales/CyberRange_Academic_Questionnaire.docx
+++ b/sales/CyberRange_Academic_Questionnaire.docx
@@ -27,7 +27,7 @@
           <w:sz w:val="28"/>
           <w:szCs w:val="28"/>
         </w:rPr>
-        <w:t xml:space="preserve">Red &amp; Blue Team Range — Adoption Questionnaire</w:t>
+        <w:t xml:space="preserve">Red &amp; Blue Team Range Adoption Questionnaire</w:t>
       </w:r>
     </w:p>
     <w:p>
@@ -54,7 +54,7 @@
           <w:sz w:val="21"/>
           <w:szCs w:val="21"/>
         </w:rPr>
-        <w:t xml:space="preserve">Thank you for considering CyberRange for your program. This short questionnaire helps us understand your teaching goals, environment, and scale so we can recommend the right deployment and scenario content for your institution. Please complete the sections that apply — estimates are fine — and return it to your CyberRange contact. Anything you are unsure about, leave blank and we will cover it in a follow-up call.</w:t>
+        <w:t xml:space="preserve">Thank you for considering CyberRange for your program. This short questionnaire helps us understand your teaching goals, environment, and scale so we can recommend the right deployment and scenario content for your institution. Please complete the sections that apply (estimates are fine) and return it to your CyberRange contact. Anything you are unsure about, leave blank and we will cover it in a follow-up call.</w:t>
       </w:r>
     </w:p>
     <w:p>
@@ -2507,7 +2507,7 @@
           <w:sz w:val="21"/>
           <w:szCs w:val="21"/>
         </w:rPr>
-        <w:t xml:space="preserve">Not sure — advise us     </w:t>
+        <w:t xml:space="preserve">Not sure, advise us     </w:t>
       </w:r>
     </w:p>
     <w:p>

</xml_diff>

<commit_message>
Add VotalAI logo to top of the questionnaire
Embed the real brand logo (sales/votalai-logo.png, from PNG Format Logo 3/
VotalAI_Logo-Black.png) at the top of the questionnaire via ImageRun. Embedded
image is byte-identical to the source; docx validated.

Co-Authored-By: Claude Opus 4.8 <noreply@anthropic.com>
</commit_message>
<xml_diff>
--- a/sales/CyberRange_Academic_Questionnaire.docx
+++ b/sales/CyberRange_Academic_Questionnaire.docx
@@ -2,6 +2,51 @@
 <file path=word/document.xml><?xml version="1.0" encoding="utf-8"?>
 <w:document xmlns:wpc="http://schemas.microsoft.com/office/word/2010/wordprocessingCanvas" xmlns:mc="http://schemas.openxmlformats.org/markup-compatibility/2006" xmlns:o="urn:schemas-microsoft-com:office:office" xmlns:r="http://schemas.openxmlformats.org/officeDocument/2006/relationships" xmlns:m="http://schemas.openxmlformats.org/officeDocument/2006/math" xmlns:v="urn:schemas-microsoft-com:vml" xmlns:wp14="http://schemas.microsoft.com/office/word/2010/wordprocessingDrawing" xmlns:wp="http://schemas.openxmlformats.org/drawingml/2006/wordprocessingDrawing" xmlns:w10="urn:schemas-microsoft-com:office:word" xmlns:w="http://schemas.openxmlformats.org/wordprocessingml/2006/main" xmlns:w14="http://schemas.microsoft.com/office/word/2010/wordml" xmlns:w15="http://schemas.microsoft.com/office/word/2012/wordml" xmlns:wpg="http://schemas.microsoft.com/office/word/2010/wordprocessingGroup" xmlns:wpi="http://schemas.microsoft.com/office/word/2010/wordprocessingInk" xmlns:wne="http://schemas.microsoft.com/office/word/2006/wordml" xmlns:wps="http://schemas.microsoft.com/office/word/2010/wordprocessingShape" xmlns:cx="http://schemas.microsoft.com/office/drawing/2014/chartex" xmlns:cx1="http://schemas.microsoft.com/office/drawing/2015/9/8/chartex" xmlns:cx2="http://schemas.microsoft.com/office/drawing/2015/10/21/chartex" xmlns:cx3="http://schemas.microsoft.com/office/drawing/2016/5/9/chartex" xmlns:cx4="http://schemas.microsoft.com/office/drawing/2016/5/10/chartex" xmlns:cx5="http://schemas.microsoft.com/office/drawing/2016/5/11/chartex" xmlns:cx6="http://schemas.microsoft.com/office/drawing/2016/5/12/chartex" xmlns:cx7="http://schemas.microsoft.com/office/drawing/2016/5/13/chartex" xmlns:cx8="http://schemas.microsoft.com/office/drawing/2016/5/14/chartex" xmlns:aink="http://schemas.microsoft.com/office/drawing/2016/ink" xmlns:am3d="http://schemas.microsoft.com/office/drawing/2017/model3d" xmlns:w16cex="http://schemas.microsoft.com/office/word/2018/wordml/cex" xmlns:w16cid="http://schemas.microsoft.com/office/word/2016/wordml/cid" xmlns:w16="http://schemas.microsoft.com/office/word/2018/wordml" xmlns:w16sdtdh="http://schemas.microsoft.com/office/word/2020/wordml/sdtdatahash" xmlns:w16se="http://schemas.microsoft.com/office/word/2015/wordml/symex" mc:Ignorable="w14 w15 wp14">
   <w:body>
+    <w:p>
+      <w:pPr>
+        <w:spacing w:after="200"/>
+      </w:pPr>
+      <w:r>
+        <w:drawing>
+          <wp:inline distT="0" distB="0" distL="0" distR="0">
+            <wp:extent cx="2190750" cy="600075"/>
+            <wp:effectExtent t="0" r="0" b="0" l="0"/>
+            <wp:docPr id="1" name="" descr="" title=""/>
+            <wp:cNvGraphicFramePr>
+              <a:graphicFrameLocks xmlns:a="http://schemas.openxmlformats.org/drawingml/2006/main" noChangeAspect="1"/>
+            </wp:cNvGraphicFramePr>
+            <a:graphic xmlns:a="http://schemas.openxmlformats.org/drawingml/2006/main">
+              <a:graphicData uri="http://schemas.openxmlformats.org/drawingml/2006/picture">
+                <pic:pic xmlns:pic="http://schemas.openxmlformats.org/drawingml/2006/picture">
+                  <pic:nvPicPr>
+                    <pic:cNvPr id="0" name="" descr=""/>
+                    <pic:cNvPicPr>
+                      <a:picLocks noChangeAspect="1" noChangeArrowheads="1"/>
+                    </pic:cNvPicPr>
+                  </pic:nvPicPr>
+                  <pic:blipFill>
+                    <a:blip r:embed="rId7" cstate="none"/>
+                    <a:srcRect/>
+                    <a:stretch>
+                      <a:fillRect/>
+                    </a:stretch>
+                  </pic:blipFill>
+                  <pic:spPr bwMode="auto">
+                    <a:xfrm>
+                      <a:off x="0" y="0"/>
+                      <a:ext cx="2190750" cy="600075"/>
+                    </a:xfrm>
+                    <a:prstGeom prst="rect">
+                      <a:avLst/>
+                    </a:prstGeom>
+                  </pic:spPr>
+                </pic:pic>
+              </a:graphicData>
+            </a:graphic>
+          </wp:inline>
+        </w:drawing>
+      </w:r>
+    </w:p>
     <w:p>
       <w:pPr>
         <w:spacing w:after="40"/>

</xml_diff>

<commit_message>
Questionnaire: remove remaining en dashes (fully dash-free)
Replace the two en dashes (10-15 minutes, top 2-3 outcomes) with plain wording.
Questionnaire docx now has zero em and zero en dashes; VotalAI logo intact.

Co-Authored-By: Claude Opus 4.8 <noreply@anthropic.com>
</commit_message>
<xml_diff>
--- a/sales/CyberRange_Academic_Questionnaire.docx
+++ b/sales/CyberRange_Academic_Questionnaire.docx
@@ -139,7 +139,7 @@
           <w:sz w:val="18"/>
           <w:szCs w:val="18"/>
         </w:rPr>
-        <w:t xml:space="preserve">Estimated time to complete: 10–15 minutes</w:t>
+        <w:t xml:space="preserve">Estimated time to complete: 10 to 15 minutes</w:t>
       </w:r>
     </w:p>
     <w:p>
@@ -2425,7 +2425,7 @@
           <w:sz w:val="21"/>
           <w:szCs w:val="21"/>
         </w:rPr>
-        <w:t xml:space="preserve">What would make this a success for your program? (top 2–3 outcomes)</w:t>
+        <w:t xml:space="preserve">What would make this a success for your program? (top 2 to 3 outcomes)</w:t>
       </w:r>
     </w:p>
     <w:p>

</xml_diff>